<commit_message>
Ajout des slides, module et generateur FX2 dans le repo
</commit_message>
<xml_diff>
--- a/_demos/Demo_FX.docx
+++ b/_demos/Demo_FX.docx
@@ -171,7 +171,7 @@
                 <w:sz w:val="20"/>
                 <w:szCs w:val="20"/>
               </w:rPr>
-              <w:t xml:space="preserve">15 minutes</w:t>
+              <w:t xml:space="preserve">18 minutes, en trois temps</w:t>
             </w:r>
           </w:p>
         </w:tc>
@@ -194,7 +194,7 @@
                 <w:sz w:val="20"/>
                 <w:szCs w:val="20"/>
               </w:rPr>
-              <w:t xml:space="preserve">avant FX.1</w:t>
+              <w:t xml:space="preserve">avant FX.1, FX.4 et FX.5</w:t>
             </w:r>
           </w:p>
         </w:tc>
@@ -271,6 +271,75 @@
           <w:szCs w:val="22"/>
         </w:rPr>
         <w:t xml:space="preserve">C'est le seul geste de l'année qu'un étudiant ne peut pas deviner, et c'est la question 5 de l'examen. Deux applications : le lien lui-même, puis le voyage de l'événement.</w:t>
+      </w:r>
+    </w:p>
+    <w:p>
+      <w:pPr>
+        <w:spacing w:after="120"/>
+      </w:pPr>
+      <w:r>
+        <w:rPr>
+          <w:b/>
+          <w:bCs/>
+          <w:sz w:val="22"/>
+          <w:szCs w:val="22"/>
+        </w:rPr>
+        <w:t xml:space="preserve">Jouée en trois temps. </w:t>
+      </w:r>
+      <w:r>
+        <w:rPr>
+          <w:sz w:val="22"/>
+          <w:szCs w:val="22"/>
+        </w:rPr>
+        <w:t xml:space="preserve">Le deck FX1 l'appelle trois fois : étapes 1 et 2 avant </w:t>
+      </w:r>
+      <w:r>
+        <w:rPr>
+          <w:rFonts w:ascii="Consolas" w:cs="Consolas" w:eastAsia="Consolas" w:hAnsi="Consolas"/>
+          <w:color w:val="8B2500"/>
+          <w:sz w:val="22"/>
+          <w:szCs w:val="22"/>
+        </w:rPr>
+        <w:t xml:space="preserve">FX.1</w:t>
+      </w:r>
+      <w:r>
+        <w:rPr>
+          <w:sz w:val="22"/>
+          <w:szCs w:val="22"/>
+        </w:rPr>
+        <w:t xml:space="preserve"> (slide 3.3), étape 3 avant </w:t>
+      </w:r>
+      <w:r>
+        <w:rPr>
+          <w:rFonts w:ascii="Consolas" w:cs="Consolas" w:eastAsia="Consolas" w:hAnsi="Consolas"/>
+          <w:color w:val="8B2500"/>
+          <w:sz w:val="22"/>
+          <w:szCs w:val="22"/>
+        </w:rPr>
+        <w:t xml:space="preserve">FX.4</w:t>
+      </w:r>
+      <w:r>
+        <w:rPr>
+          <w:sz w:val="22"/>
+          <w:szCs w:val="22"/>
+        </w:rPr>
+        <w:t xml:space="preserve"> (slide 4.2), étapes 4 et 5 avant </w:t>
+      </w:r>
+      <w:r>
+        <w:rPr>
+          <w:rFonts w:ascii="Consolas" w:cs="Consolas" w:eastAsia="Consolas" w:hAnsi="Consolas"/>
+          <w:color w:val="8B2500"/>
+          <w:sz w:val="22"/>
+          <w:szCs w:val="22"/>
+        </w:rPr>
+        <w:t xml:space="preserve">FX.5</w:t>
+      </w:r>
+      <w:r>
+        <w:rPr>
+          <w:sz w:val="22"/>
+          <w:szCs w:val="22"/>
+        </w:rPr>
+        <w:t xml:space="preserve"> (slide 5.2). Chaque reprise coûte une minute de plus que le déroulé ci-dessous : rouvrir le code, relancer l'application.</w:t>
       </w:r>
     </w:p>
     <w:p>
@@ -1263,7 +1332,7 @@
                 <w:sz w:val="18"/>
                 <w:szCs w:val="18"/>
               </w:rPr>
-              <w:t xml:space="preserve">IDE.16</w:t>
+              <w:t xml:space="preserve">IDE.15</w:t>
             </w:r>
           </w:p>
         </w:tc>

</xml_diff>

<commit_message>
Mise à jour de certaines tournures de phrases
</commit_message>
<xml_diff>
--- a/_demos/Demo_FX.docx
+++ b/_demos/Demo_FX.docx
@@ -740,7 +740,7 @@
           <w:sz w:val="26"/>
           <w:szCs w:val="26"/>
         </w:rPr>
-        <w:t xml:space="preserve">L'événement porte de l'information</w:t>
+        <w:t xml:space="preserve">L'événement contient de l'information</w:t>
       </w:r>
       <w:r>
         <w:rPr>
@@ -1246,7 +1246,7 @@
                 <w:sz w:val="22"/>
                 <w:szCs w:val="22"/>
               </w:rPr>
-              <w:t xml:space="preserve">on ne donne pas au bouton ce que la méthode rend, on lui donne de quoi l'appeler plus tard. C'est toute la différence entre une valeur et un comportement.</w:t>
+              <w:t xml:space="preserve">on ne donne pas au bouton ce que la méthode retourne, on lui donne de quoi l'appeler plus tard. C'est toute la différence entre une valeur et un comportement.</w:t>
             </w:r>
           </w:p>
         </w:tc>

</xml_diff>